<commit_message>
Replace production figures with orders of magnitude
Row counts, coverage and match rates, pack and mailing counts and measured
ratios from real data were spelled out across the docs, the FitNesse
mirrors, SQL comments and READMEs. They now read as orders of magnitude or
qualitative statements; schema metadata, design thresholds and dates stay.
Real sample tracking ids, page names, GUIDs and fixture GPNs became
synthetic values of the same format. The check script now also flags
secret-like literals.

Co-Authored-By: Claude Opus 5.5 (1M context) <noreply@anthropic.com>
</commit_message>
<xml_diff>
--- a/docs/superpowers/plans/2026-07-15-page-engagement-beacon.docx
+++ b/docs/superpowers/plans/2026-07-15-page-engagement-beacon.docx
@@ -1049,7 +1049,7 @@
         <w:rPr>
           <w:rStyle w:val="VerbatimChar"/>
         </w:rPr>
-        <w:t xml:space="preserve">// The spec (§7) estimates ~2 flushes/page view =&gt; up to +350M events/year.</w:t>
+        <w:t xml:space="preserve">// The spec (§7) estimates ~2 flushes/page view =&gt; up to hundreds of millions of additional events/year.</w:t>
       </w:r>
       <w:r>
         <w:br/>
@@ -1451,7 +1451,25 @@
         <w:rPr>
           <w:rStyle w:val="NormalTok"/>
         </w:rPr>
-        <w:t xml:space="preserve"> /Users/micha/Documents/Arbeit</w:t>
+        <w:t xml:space="preserve"> </w:t>
+      </w:r>
+      <w:r>
+        <w:rPr>
+          <w:rStyle w:val="OperatorTok"/>
+        </w:rPr>
+        <w:t xml:space="preserve">&lt;</w:t>
+      </w:r>
+      <w:r>
+        <w:rPr>
+          <w:rStyle w:val="NormalTok"/>
+        </w:rPr>
+        <w:t xml:space="preserve">parent-folder-of-the-sibling-projects</w:t>
+      </w:r>
+      <w:r>
+        <w:rPr>
+          <w:rStyle w:val="OperatorTok"/>
+        </w:rPr>
+        <w:t xml:space="preserve">&gt;</w:t>
       </w:r>
       <w:r>
         <w:br/>
@@ -7979,7 +7997,7 @@
         <w:rPr>
           <w:rStyle w:val="CommentTok"/>
         </w:rPr>
-        <w:t xml:space="preserve"># View C: single-flush view (the 73% case the beacon exists for)</w:t>
+        <w:t xml:space="preserve"># View C: single-flush view (the majority case the beacon exists for)</w:t>
       </w:r>
       <w:r>
         <w:br/>
@@ -21504,7 +21522,22 @@
         </w:numPr>
       </w:pPr>
       <w:r>
-        <w:t xml:space="preserve">Produces: two self-contained DOCX files Michael can attach/upload in the corporate environment. Re-run this task's pandoc commands whenever either Markdown file changes.</w:t>
+        <w:t xml:space="preserve">Produces: two self-contained DOCX files</w:t>
+      </w:r>
+      <w:r>
+        <w:t xml:space="preserve"> </w:t>
+      </w:r>
+      <w:r>
+        <w:rPr>
+          <w:rStyle w:val="VerbatimChar"/>
+        </w:rPr>
+        <w:t xml:space="preserve">&lt;name&gt;</w:t>
+      </w:r>
+      <w:r>
+        <w:t xml:space="preserve"> </w:t>
+      </w:r>
+      <w:r>
+        <w:t xml:space="preserve">can attach/upload in the corporate environment. Re-run this task's pandoc commands whenever either Markdown file changes.</w:t>
       </w:r>
     </w:p>
     <w:p>
@@ -21578,7 +21611,25 @@
         <w:rPr>
           <w:rStyle w:val="NormalTok"/>
         </w:rPr>
-        <w:t xml:space="preserve"> /Users/micha/Documents/Arbeit/Databricks</w:t>
+        <w:t xml:space="preserve"> </w:t>
+      </w:r>
+      <w:r>
+        <w:rPr>
+          <w:rStyle w:val="OperatorTok"/>
+        </w:rPr>
+        <w:t xml:space="preserve">&lt;</w:t>
+      </w:r>
+      <w:r>
+        <w:rPr>
+          <w:rStyle w:val="NormalTok"/>
+        </w:rPr>
+        <w:t xml:space="preserve">repo-root</w:t>
+      </w:r>
+      <w:r>
+        <w:rPr>
+          <w:rStyle w:val="OperatorTok"/>
+        </w:rPr>
+        <w:t xml:space="preserve">&gt;</w:t>
       </w:r>
       <w:r>
         <w:br/>

</xml_diff>